<commit_message>
Updated web layout and functional
</commit_message>
<xml_diff>
--- a/LAB_FINAL_EXAM(FA22-BSE-192).docx
+++ b/LAB_FINAL_EXAM(FA22-BSE-192).docx
@@ -143,7 +143,7 @@
                         <pic:cNvPicPr/>
                       </pic:nvPicPr>
                       <pic:blipFill>
-                        <a:blip r:embed="rId5">
+                        <a:blip r:embed="rId7">
                           <a:extLst>
                             <a:ext uri="{28A0092B-C50C-407E-A947-70E740481C1C}">
                               <a14:useLocalDpi xmlns:a14="http://schemas.microsoft.com/office/drawing/2010/main" val="0"/>
@@ -245,29 +245,7 @@
               <w:sz w:val="28"/>
               <w:szCs w:val="28"/>
             </w:rPr>
-            <w:t xml:space="preserve">Sir </w:t>
-          </w:r>
-          <w:proofErr w:type="spellStart"/>
-          <w:r>
-            <w:rPr>
-              <w:b/>
-              <w:bCs/>
-              <w:color w:val="000000"/>
-              <w:sz w:val="28"/>
-              <w:szCs w:val="28"/>
-            </w:rPr>
-            <w:t>Inzmam</w:t>
-          </w:r>
-          <w:proofErr w:type="spellEnd"/>
-          <w:r>
-            <w:rPr>
-              <w:b/>
-              <w:bCs/>
-              <w:color w:val="000000"/>
-              <w:sz w:val="28"/>
-              <w:szCs w:val="28"/>
-            </w:rPr>
-            <w:t xml:space="preserve"> ul Haq</w:t>
+            <w:t>Sir Inzmam ul Haq</w:t>
           </w:r>
         </w:p>
         <w:p>
@@ -585,10 +563,1526 @@
     </w:p>
     <w:p>
       <w:pPr>
-        <w:pStyle w:val="NormalWeb"/>
-        <w:spacing w:before="0" w:beforeAutospacing="0" w:after="0" w:afterAutospacing="0"/>
-        <w:jc w:val="center"/>
-      </w:pPr>
+        <w:pStyle w:val="Heading1"/>
+      </w:pPr>
+      <w:r>
+        <w:lastRenderedPageBreak/>
+        <w:t>SECTION A: CONTAINERIZATION (10 Marks)</w:t>
+      </w:r>
+    </w:p>
+    <w:p>
+      <w:pPr>
+        <w:pStyle w:val="NormalWeb"/>
+        <w:spacing w:after="0"/>
+      </w:pPr>
+      <w:r>
+        <w:t>Task A1: Docker Images</w:t>
+      </w:r>
+    </w:p>
+    <w:p>
+      <w:pPr>
+        <w:pStyle w:val="NormalWeb"/>
+        <w:spacing w:after="0"/>
+      </w:pPr>
+      <w:r>
+        <w:t>Create separate Dockerfiles for:</w:t>
+      </w:r>
+    </w:p>
+    <w:p>
+      <w:pPr>
+        <w:pStyle w:val="NormalWeb"/>
+        <w:spacing w:after="0"/>
+      </w:pPr>
+      <w:r>
+        <w:t> Your frontend application</w:t>
+      </w:r>
+    </w:p>
+    <w:p>
+      <w:pPr>
+        <w:pStyle w:val="NormalWeb"/>
+        <w:spacing w:after="0"/>
+      </w:pPr>
+    </w:p>
+    <w:p>
+      <w:pPr>
+        <w:pStyle w:val="NormalWeb"/>
+        <w:spacing w:after="0"/>
+      </w:pPr>
+      <w:r>
+        <w:t> Your backend application</w:t>
+      </w:r>
+    </w:p>
+    <w:p>
+      <w:pPr>
+        <w:pStyle w:val="NormalWeb"/>
+        <w:spacing w:after="0"/>
+      </w:pPr>
+    </w:p>
+    <w:p>
+      <w:pPr>
+        <w:pStyle w:val="NormalWeb"/>
+        <w:spacing w:after="0"/>
+      </w:pPr>
+      <w:r>
+        <w:t> Your database</w:t>
+      </w:r>
+    </w:p>
+    <w:p>
+      <w:pPr>
+        <w:pStyle w:val="NormalWeb"/>
+        <w:spacing w:after="0"/>
+      </w:pPr>
+    </w:p>
+    <w:p>
+      <w:pPr>
+        <w:pStyle w:val="NormalWeb"/>
+        <w:spacing w:after="0"/>
+      </w:pPr>
+      <w:r>
+        <w:t>Task A2: Multi-Service Setup using Docker Compose</w:t>
+      </w:r>
+    </w:p>
+    <w:p>
+      <w:pPr>
+        <w:pStyle w:val="NormalWeb"/>
+        <w:spacing w:after="0"/>
+      </w:pPr>
+      <w:r>
+        <w:t>Prepare a docker-compose.yml that:</w:t>
+      </w:r>
+    </w:p>
+    <w:p>
+      <w:pPr>
+        <w:pStyle w:val="NormalWeb"/>
+        <w:spacing w:after="0"/>
+      </w:pPr>
+      <w:r>
+        <w:t> Starts all three services</w:t>
+      </w:r>
+    </w:p>
+    <w:p>
+      <w:pPr>
+        <w:pStyle w:val="NormalWeb"/>
+        <w:spacing w:after="0"/>
+      </w:pPr>
+      <w:r>
+        <w:t> Connects them in a common network</w:t>
+      </w:r>
+    </w:p>
+    <w:p>
+      <w:pPr>
+        <w:pStyle w:val="NormalWeb"/>
+        <w:spacing w:after="0"/>
+      </w:pPr>
+      <w:r>
+        <w:t> Persists DB data</w:t>
+      </w:r>
+    </w:p>
+    <w:p>
+      <w:pPr>
+        <w:pStyle w:val="NormalWeb"/>
+        <w:spacing w:after="0"/>
+      </w:pPr>
+    </w:p>
+    <w:p>
+      <w:pPr>
+        <w:pStyle w:val="NormalWeb"/>
+        <w:spacing w:after="0"/>
+      </w:pPr>
+      <w:r>
+        <w:t>�� Submit:</w:t>
+      </w:r>
+    </w:p>
+    <w:p>
+      <w:pPr>
+        <w:pStyle w:val="NormalWeb"/>
+        <w:spacing w:before="0" w:beforeAutospacing="0" w:after="0" w:afterAutospacing="0"/>
+      </w:pPr>
+      <w:r>
+        <w:lastRenderedPageBreak/>
+        <w:t>Following are the screenshots:</w:t>
+      </w:r>
+      <w:r>
+        <w:br/>
+      </w:r>
+      <w:r>
+        <w:drawing>
+          <wp:inline distT="0" distB="0" distL="0" distR="0" wp14:anchorId="5EC215F1" wp14:editId="25790E40">
+            <wp:extent cx="5943600" cy="7501890"/>
+            <wp:effectExtent l="0" t="0" r="0" b="3810"/>
+            <wp:docPr id="464445184" name="Picture 1"/>
+            <wp:cNvGraphicFramePr>
+              <a:graphicFrameLocks xmlns:a="http://schemas.openxmlformats.org/drawingml/2006/main" noChangeAspect="1"/>
+            </wp:cNvGraphicFramePr>
+            <a:graphic xmlns:a="http://schemas.openxmlformats.org/drawingml/2006/main">
+              <a:graphicData uri="http://schemas.openxmlformats.org/drawingml/2006/picture">
+                <pic:pic xmlns:pic="http://schemas.openxmlformats.org/drawingml/2006/picture">
+                  <pic:nvPicPr>
+                    <pic:cNvPr id="464445184" name=""/>
+                    <pic:cNvPicPr/>
+                  </pic:nvPicPr>
+                  <pic:blipFill>
+                    <a:blip r:embed="rId8"/>
+                    <a:stretch>
+                      <a:fillRect/>
+                    </a:stretch>
+                  </pic:blipFill>
+                  <pic:spPr>
+                    <a:xfrm>
+                      <a:off x="0" y="0"/>
+                      <a:ext cx="5943600" cy="7501890"/>
+                    </a:xfrm>
+                    <a:prstGeom prst="rect">
+                      <a:avLst/>
+                    </a:prstGeom>
+                  </pic:spPr>
+                </pic:pic>
+              </a:graphicData>
+            </a:graphic>
+          </wp:inline>
+        </w:drawing>
+      </w:r>
+    </w:p>
+    <w:p>
+      <w:pPr>
+        <w:pStyle w:val="NormalWeb"/>
+        <w:spacing w:before="0" w:beforeAutospacing="0" w:after="0" w:afterAutospacing="0"/>
+      </w:pPr>
+      <w:r>
+        <w:lastRenderedPageBreak/>
+        <w:drawing>
+          <wp:inline distT="0" distB="0" distL="0" distR="0" wp14:anchorId="457E07CC" wp14:editId="74CFF124">
+            <wp:extent cx="5943600" cy="3394075"/>
+            <wp:effectExtent l="0" t="0" r="0" b="0"/>
+            <wp:docPr id="1773433566" name="Picture 1"/>
+            <wp:cNvGraphicFramePr>
+              <a:graphicFrameLocks xmlns:a="http://schemas.openxmlformats.org/drawingml/2006/main" noChangeAspect="1"/>
+            </wp:cNvGraphicFramePr>
+            <a:graphic xmlns:a="http://schemas.openxmlformats.org/drawingml/2006/main">
+              <a:graphicData uri="http://schemas.openxmlformats.org/drawingml/2006/picture">
+                <pic:pic xmlns:pic="http://schemas.openxmlformats.org/drawingml/2006/picture">
+                  <pic:nvPicPr>
+                    <pic:cNvPr id="1773433566" name=""/>
+                    <pic:cNvPicPr/>
+                  </pic:nvPicPr>
+                  <pic:blipFill>
+                    <a:blip r:embed="rId9"/>
+                    <a:stretch>
+                      <a:fillRect/>
+                    </a:stretch>
+                  </pic:blipFill>
+                  <pic:spPr>
+                    <a:xfrm>
+                      <a:off x="0" y="0"/>
+                      <a:ext cx="5943600" cy="3394075"/>
+                    </a:xfrm>
+                    <a:prstGeom prst="rect">
+                      <a:avLst/>
+                    </a:prstGeom>
+                  </pic:spPr>
+                </pic:pic>
+              </a:graphicData>
+            </a:graphic>
+          </wp:inline>
+        </w:drawing>
+      </w:r>
+    </w:p>
+    <w:p>
+      <w:pPr>
+        <w:pStyle w:val="NormalWeb"/>
+        <w:spacing w:before="0" w:beforeAutospacing="0" w:after="0" w:afterAutospacing="0"/>
+      </w:pPr>
+      <w:r>
+        <w:drawing>
+          <wp:inline distT="0" distB="0" distL="0" distR="0" wp14:anchorId="7FBE032E" wp14:editId="1402ADBD">
+            <wp:extent cx="5943600" cy="3406775"/>
+            <wp:effectExtent l="0" t="0" r="0" b="3175"/>
+            <wp:docPr id="1549358948" name="Picture 1" descr="A screenshot of a computer&#10;&#10;AI-generated content may be incorrect."/>
+            <wp:cNvGraphicFramePr>
+              <a:graphicFrameLocks xmlns:a="http://schemas.openxmlformats.org/drawingml/2006/main" noChangeAspect="1"/>
+            </wp:cNvGraphicFramePr>
+            <a:graphic xmlns:a="http://schemas.openxmlformats.org/drawingml/2006/main">
+              <a:graphicData uri="http://schemas.openxmlformats.org/drawingml/2006/picture">
+                <pic:pic xmlns:pic="http://schemas.openxmlformats.org/drawingml/2006/picture">
+                  <pic:nvPicPr>
+                    <pic:cNvPr id="1549358948" name="Picture 1" descr="A screenshot of a computer&#10;&#10;AI-generated content may be incorrect."/>
+                    <pic:cNvPicPr/>
+                  </pic:nvPicPr>
+                  <pic:blipFill>
+                    <a:blip r:embed="rId10"/>
+                    <a:stretch>
+                      <a:fillRect/>
+                    </a:stretch>
+                  </pic:blipFill>
+                  <pic:spPr>
+                    <a:xfrm>
+                      <a:off x="0" y="0"/>
+                      <a:ext cx="5943600" cy="3406775"/>
+                    </a:xfrm>
+                    <a:prstGeom prst="rect">
+                      <a:avLst/>
+                    </a:prstGeom>
+                  </pic:spPr>
+                </pic:pic>
+              </a:graphicData>
+            </a:graphic>
+          </wp:inline>
+        </w:drawing>
+      </w:r>
+    </w:p>
+    <w:p>
+      <w:pPr>
+        <w:pStyle w:val="NormalWeb"/>
+        <w:spacing w:before="0" w:beforeAutospacing="0" w:after="0" w:afterAutospacing="0"/>
+      </w:pPr>
+    </w:p>
+    <w:p>
+      <w:pPr>
+        <w:pStyle w:val="NormalWeb"/>
+        <w:spacing w:before="0" w:beforeAutospacing="0" w:after="0" w:afterAutospacing="0"/>
+      </w:pPr>
+    </w:p>
+    <w:p>
+      <w:pPr>
+        <w:pStyle w:val="NormalWeb"/>
+        <w:spacing w:before="0" w:beforeAutospacing="0" w:after="0" w:afterAutospacing="0"/>
+      </w:pPr>
+    </w:p>
+    <w:p>
+      <w:pPr>
+        <w:pStyle w:val="NormalWeb"/>
+        <w:spacing w:before="0" w:beforeAutospacing="0" w:after="0" w:afterAutospacing="0"/>
+      </w:pPr>
+    </w:p>
+    <w:p>
+      <w:pPr>
+        <w:pStyle w:val="NormalWeb"/>
+        <w:spacing w:before="0" w:beforeAutospacing="0" w:after="0" w:afterAutospacing="0"/>
+      </w:pPr>
+    </w:p>
+    <w:p>
+      <w:pPr>
+        <w:pStyle w:val="NormalWeb"/>
+        <w:spacing w:before="0" w:beforeAutospacing="0" w:after="0" w:afterAutospacing="0"/>
+      </w:pPr>
+    </w:p>
+    <w:p>
+      <w:pPr>
+        <w:pStyle w:val="NormalWeb"/>
+        <w:spacing w:before="0" w:beforeAutospacing="0" w:after="0" w:afterAutospacing="0"/>
+      </w:pPr>
+    </w:p>
+    <w:p>
+      <w:pPr>
+        <w:pStyle w:val="NormalWeb"/>
+        <w:spacing w:before="0" w:beforeAutospacing="0" w:after="0" w:afterAutospacing="0"/>
+      </w:pPr>
+    </w:p>
+    <w:p>
+      <w:pPr>
+        <w:pStyle w:val="Heading1"/>
+      </w:pPr>
+      <w:r>
+        <w:lastRenderedPageBreak/>
+        <w:t>SECTION B: CI/CD AUTOMATION (14 Marks)</w:t>
+      </w:r>
+    </w:p>
+    <w:p>
+      <w:pPr>
+        <w:pStyle w:val="NormalWeb"/>
+        <w:spacing w:after="0"/>
+      </w:pPr>
+      <w:r>
+        <w:t>You may use Jenkins, Azure DevOps, or GitHub Actions.</w:t>
+      </w:r>
+    </w:p>
+    <w:p>
+      <w:pPr>
+        <w:pStyle w:val="NormalWeb"/>
+        <w:spacing w:after="0"/>
+      </w:pPr>
+      <w:r>
+        <w:t>Task B1: Pipeline Development</w:t>
+      </w:r>
+    </w:p>
+    <w:p>
+      <w:pPr>
+        <w:pStyle w:val="NormalWeb"/>
+        <w:spacing w:after="0"/>
+      </w:pPr>
+      <w:r>
+        <w:t>Build a pipeline that contains at least:</w:t>
+      </w:r>
+    </w:p>
+    <w:p>
+      <w:pPr>
+        <w:pStyle w:val="NormalWeb"/>
+        <w:spacing w:after="0"/>
+      </w:pPr>
+      <w:r>
+        <w:t>1. Build stage (frontend + backend)</w:t>
+      </w:r>
+    </w:p>
+    <w:p>
+      <w:pPr>
+        <w:pStyle w:val="NormalWeb"/>
+        <w:spacing w:after="0"/>
+      </w:pPr>
+      <w:r>
+        <w:t>2. Automated tests</w:t>
+      </w:r>
+    </w:p>
+    <w:p>
+      <w:pPr>
+        <w:pStyle w:val="NormalWeb"/>
+        <w:spacing w:after="0"/>
+      </w:pPr>
+      <w:r>
+        <w:t>3. Docker image build and push to registry</w:t>
+      </w:r>
+    </w:p>
+    <w:p>
+      <w:pPr>
+        <w:pStyle w:val="NormalWeb"/>
+        <w:spacing w:after="0"/>
+      </w:pPr>
+      <w:r>
+        <w:t>4. Deployment step to Kubernetes (or staging server)</w:t>
+      </w:r>
+    </w:p>
+    <w:p>
+      <w:pPr>
+        <w:pStyle w:val="NormalWeb"/>
+        <w:spacing w:after="0"/>
+      </w:pPr>
+      <w:r>
+        <w:t>Task B2: Trigger Configuration</w:t>
+      </w:r>
+    </w:p>
+    <w:p>
+      <w:pPr>
+        <w:pStyle w:val="NormalWeb"/>
+        <w:spacing w:after="0"/>
+      </w:pPr>
+      <w:r>
+        <w:t>Configure the pipeline so it runs on push/commit or pull request.</w:t>
+      </w:r>
+    </w:p>
+    <w:p>
+      <w:pPr>
+        <w:pStyle w:val="NormalWeb"/>
+        <w:spacing w:after="0"/>
+      </w:pPr>
+      <w:r>
+        <w:t>�� Submit:</w:t>
+      </w:r>
+    </w:p>
+    <w:p>
+      <w:pPr>
+        <w:pStyle w:val="NormalWeb"/>
+        <w:spacing w:before="0" w:beforeAutospacing="0" w:after="0" w:afterAutospacing="0"/>
+      </w:pPr>
+    </w:p>
+    <w:p>
+      <w:pPr>
+        <w:pStyle w:val="NormalWeb"/>
+        <w:spacing w:before="0" w:beforeAutospacing="0" w:after="0" w:afterAutospacing="0"/>
+      </w:pPr>
+      <w:r>
+        <w:drawing>
+          <wp:inline distT="0" distB="0" distL="0" distR="0" wp14:anchorId="059D74A0" wp14:editId="1A471B04">
+            <wp:extent cx="5943600" cy="2661920"/>
+            <wp:effectExtent l="0" t="0" r="0" b="5080"/>
+            <wp:docPr id="917228377" name="Picture 1" descr="A screen shot of a computer&#10;&#10;AI-generated content may be incorrect."/>
+            <wp:cNvGraphicFramePr>
+              <a:graphicFrameLocks xmlns:a="http://schemas.openxmlformats.org/drawingml/2006/main" noChangeAspect="1"/>
+            </wp:cNvGraphicFramePr>
+            <a:graphic xmlns:a="http://schemas.openxmlformats.org/drawingml/2006/main">
+              <a:graphicData uri="http://schemas.openxmlformats.org/drawingml/2006/picture">
+                <pic:pic xmlns:pic="http://schemas.openxmlformats.org/drawingml/2006/picture">
+                  <pic:nvPicPr>
+                    <pic:cNvPr id="917228377" name="Picture 1" descr="A screen shot of a computer&#10;&#10;AI-generated content may be incorrect."/>
+                    <pic:cNvPicPr/>
+                  </pic:nvPicPr>
+                  <pic:blipFill>
+                    <a:blip r:embed="rId11"/>
+                    <a:stretch>
+                      <a:fillRect/>
+                    </a:stretch>
+                  </pic:blipFill>
+                  <pic:spPr>
+                    <a:xfrm>
+                      <a:off x="0" y="0"/>
+                      <a:ext cx="5943600" cy="2661920"/>
+                    </a:xfrm>
+                    <a:prstGeom prst="rect">
+                      <a:avLst/>
+                    </a:prstGeom>
+                  </pic:spPr>
+                </pic:pic>
+              </a:graphicData>
+            </a:graphic>
+          </wp:inline>
+        </w:drawing>
+      </w:r>
+    </w:p>
+    <w:p>
+      <w:pPr>
+        <w:pStyle w:val="NormalWeb"/>
+        <w:spacing w:before="0" w:beforeAutospacing="0" w:after="0" w:afterAutospacing="0"/>
+      </w:pPr>
+      <w:r>
+        <w:lastRenderedPageBreak/>
+        <w:drawing>
+          <wp:inline distT="0" distB="0" distL="0" distR="0" wp14:anchorId="76B1AB8E" wp14:editId="698661B0">
+            <wp:extent cx="5943600" cy="4655185"/>
+            <wp:effectExtent l="0" t="0" r="0" b="0"/>
+            <wp:docPr id="1164376081" name="Picture 1" descr="A screenshot of a computer&#10;&#10;AI-generated content may be incorrect."/>
+            <wp:cNvGraphicFramePr>
+              <a:graphicFrameLocks xmlns:a="http://schemas.openxmlformats.org/drawingml/2006/main" noChangeAspect="1"/>
+            </wp:cNvGraphicFramePr>
+            <a:graphic xmlns:a="http://schemas.openxmlformats.org/drawingml/2006/main">
+              <a:graphicData uri="http://schemas.openxmlformats.org/drawingml/2006/picture">
+                <pic:pic xmlns:pic="http://schemas.openxmlformats.org/drawingml/2006/picture">
+                  <pic:nvPicPr>
+                    <pic:cNvPr id="1164376081" name="Picture 1" descr="A screenshot of a computer&#10;&#10;AI-generated content may be incorrect."/>
+                    <pic:cNvPicPr/>
+                  </pic:nvPicPr>
+                  <pic:blipFill>
+                    <a:blip r:embed="rId12"/>
+                    <a:stretch>
+                      <a:fillRect/>
+                    </a:stretch>
+                  </pic:blipFill>
+                  <pic:spPr>
+                    <a:xfrm>
+                      <a:off x="0" y="0"/>
+                      <a:ext cx="5943600" cy="4655185"/>
+                    </a:xfrm>
+                    <a:prstGeom prst="rect">
+                      <a:avLst/>
+                    </a:prstGeom>
+                  </pic:spPr>
+                </pic:pic>
+              </a:graphicData>
+            </a:graphic>
+          </wp:inline>
+        </w:drawing>
+      </w:r>
+      <w:r>
+        <w:br/>
+      </w:r>
+    </w:p>
+    <w:p>
+      <w:pPr>
+        <w:pStyle w:val="NormalWeb"/>
+        <w:spacing w:before="0" w:beforeAutospacing="0" w:after="0" w:afterAutospacing="0"/>
+      </w:pPr>
+    </w:p>
+    <w:p>
+      <w:pPr>
+        <w:pStyle w:val="NormalWeb"/>
+        <w:spacing w:before="0" w:beforeAutospacing="0" w:after="0" w:afterAutospacing="0"/>
+      </w:pPr>
+    </w:p>
+    <w:p>
+      <w:pPr>
+        <w:pStyle w:val="NormalWeb"/>
+        <w:spacing w:before="0" w:beforeAutospacing="0" w:after="0" w:afterAutospacing="0"/>
+      </w:pPr>
+    </w:p>
+    <w:p>
+      <w:pPr>
+        <w:pStyle w:val="NormalWeb"/>
+        <w:spacing w:before="0" w:beforeAutospacing="0" w:after="0" w:afterAutospacing="0"/>
+      </w:pPr>
+    </w:p>
+    <w:p>
+      <w:pPr>
+        <w:pStyle w:val="NormalWeb"/>
+        <w:spacing w:before="0" w:beforeAutospacing="0" w:after="0" w:afterAutospacing="0"/>
+      </w:pPr>
+    </w:p>
+    <w:p>
+      <w:pPr>
+        <w:pStyle w:val="NormalWeb"/>
+        <w:spacing w:before="0" w:beforeAutospacing="0" w:after="0" w:afterAutospacing="0"/>
+      </w:pPr>
+    </w:p>
+    <w:p>
+      <w:pPr>
+        <w:pStyle w:val="NormalWeb"/>
+        <w:spacing w:before="0" w:beforeAutospacing="0" w:after="0" w:afterAutospacing="0"/>
+      </w:pPr>
+    </w:p>
+    <w:p>
+      <w:pPr>
+        <w:pStyle w:val="NormalWeb"/>
+        <w:spacing w:before="0" w:beforeAutospacing="0" w:after="0" w:afterAutospacing="0"/>
+      </w:pPr>
+    </w:p>
+    <w:p>
+      <w:pPr>
+        <w:pStyle w:val="NormalWeb"/>
+        <w:spacing w:before="0" w:beforeAutospacing="0" w:after="0" w:afterAutospacing="0"/>
+      </w:pPr>
+    </w:p>
+    <w:p>
+      <w:pPr>
+        <w:pStyle w:val="NormalWeb"/>
+        <w:spacing w:before="0" w:beforeAutospacing="0" w:after="0" w:afterAutospacing="0"/>
+      </w:pPr>
+    </w:p>
+    <w:p>
+      <w:pPr>
+        <w:pStyle w:val="NormalWeb"/>
+        <w:spacing w:before="0" w:beforeAutospacing="0" w:after="0" w:afterAutospacing="0"/>
+      </w:pPr>
+    </w:p>
+    <w:p>
+      <w:pPr>
+        <w:pStyle w:val="NormalWeb"/>
+        <w:spacing w:before="0" w:beforeAutospacing="0" w:after="0" w:afterAutospacing="0"/>
+      </w:pPr>
+    </w:p>
+    <w:p>
+      <w:pPr>
+        <w:pStyle w:val="NormalWeb"/>
+        <w:spacing w:before="0" w:beforeAutospacing="0" w:after="0" w:afterAutospacing="0"/>
+      </w:pPr>
+    </w:p>
+    <w:p>
+      <w:pPr>
+        <w:pStyle w:val="NormalWeb"/>
+        <w:spacing w:before="0" w:beforeAutospacing="0" w:after="0" w:afterAutospacing="0"/>
+      </w:pPr>
+    </w:p>
+    <w:p>
+      <w:pPr>
+        <w:pStyle w:val="NormalWeb"/>
+        <w:spacing w:before="0" w:beforeAutospacing="0" w:after="0" w:afterAutospacing="0"/>
+      </w:pPr>
+    </w:p>
+    <w:p>
+      <w:pPr>
+        <w:pStyle w:val="NormalWeb"/>
+        <w:spacing w:before="0" w:beforeAutospacing="0" w:after="0" w:afterAutospacing="0"/>
+      </w:pPr>
+    </w:p>
+    <w:p>
+      <w:pPr>
+        <w:pStyle w:val="NormalWeb"/>
+        <w:spacing w:before="0" w:beforeAutospacing="0" w:after="0" w:afterAutospacing="0"/>
+      </w:pPr>
+    </w:p>
+    <w:p>
+      <w:pPr>
+        <w:pStyle w:val="NormalWeb"/>
+        <w:spacing w:before="0" w:beforeAutospacing="0" w:after="0" w:afterAutospacing="0"/>
+      </w:pPr>
+    </w:p>
+    <w:p>
+      <w:pPr>
+        <w:pStyle w:val="NormalWeb"/>
+        <w:spacing w:before="0" w:beforeAutospacing="0" w:after="0" w:afterAutospacing="0"/>
+      </w:pPr>
+    </w:p>
+    <w:p>
+      <w:pPr>
+        <w:pStyle w:val="Heading1"/>
+      </w:pPr>
+      <w:r>
+        <w:lastRenderedPageBreak/>
+        <w:t>SECTION C: KUBERNETES ON AZURE (AKS) (12 Marks)</w:t>
+      </w:r>
+    </w:p>
+    <w:p>
+      <w:pPr>
+        <w:pStyle w:val="NormalWeb"/>
+        <w:spacing w:after="0"/>
+      </w:pPr>
+      <w:r>
+        <w:t>Deploy your 3-tier application on Azure Kubernetes Service (AKS).</w:t>
+      </w:r>
+    </w:p>
+    <w:p>
+      <w:pPr>
+        <w:pStyle w:val="NormalWeb"/>
+        <w:spacing w:after="0"/>
+      </w:pPr>
+      <w:r>
+        <w:t>Task C1: Kubernetes Manifests</w:t>
+      </w:r>
+    </w:p>
+    <w:p>
+      <w:pPr>
+        <w:pStyle w:val="NormalWeb"/>
+        <w:spacing w:after="0"/>
+      </w:pPr>
+      <w:r>
+        <w:t> Create an Azure Kubernetes Cluster (AKS).</w:t>
+      </w:r>
+    </w:p>
+    <w:p>
+      <w:pPr>
+        <w:pStyle w:val="NormalWeb"/>
+        <w:spacing w:after="0"/>
+      </w:pPr>
+      <w:r>
+        <w:t> Deploy containerized application from Docker Hub onto AKS.</w:t>
+      </w:r>
+    </w:p>
+    <w:p>
+      <w:pPr>
+        <w:pStyle w:val="NormalWeb"/>
+        <w:spacing w:after="0"/>
+      </w:pPr>
+      <w:r>
+        <w:t> Expose the app using a public IP address and provide a reachable link.</w:t>
+      </w:r>
+    </w:p>
+    <w:p>
+      <w:pPr>
+        <w:pStyle w:val="NormalWeb"/>
+        <w:spacing w:after="0"/>
+      </w:pPr>
+      <w:r>
+        <w:t>Task C2: AKS Deployment Verification</w:t>
+      </w:r>
+    </w:p>
+    <w:p>
+      <w:pPr>
+        <w:pStyle w:val="NormalWeb"/>
+        <w:spacing w:after="0"/>
+      </w:pPr>
+      <w:r>
+        <w:t>Your application must run correctly in the cluster.</w:t>
+      </w:r>
+    </w:p>
+    <w:p>
+      <w:pPr>
+        <w:pStyle w:val="NormalWeb"/>
+        <w:spacing w:after="0"/>
+      </w:pPr>
+      <w:r>
+        <w:t>Show:</w:t>
+      </w:r>
+    </w:p>
+    <w:p>
+      <w:pPr>
+        <w:pStyle w:val="NormalWeb"/>
+        <w:spacing w:after="0"/>
+      </w:pPr>
+      <w:r>
+        <w:t> All pods in Running state</w:t>
+      </w:r>
+    </w:p>
+    <w:p>
+      <w:pPr>
+        <w:pStyle w:val="NormalWeb"/>
+        <w:spacing w:after="0"/>
+      </w:pPr>
+      <w:r>
+        <w:t> Services created successfully</w:t>
+      </w:r>
+    </w:p>
+    <w:p>
+      <w:pPr>
+        <w:pStyle w:val="NormalWeb"/>
+        <w:spacing w:after="0"/>
+      </w:pPr>
+      <w:r>
+        <w:t> Frontend connecting to backend</w:t>
+      </w:r>
+    </w:p>
+    <w:p>
+      <w:pPr>
+        <w:pStyle w:val="NormalWeb"/>
+        <w:spacing w:after="0"/>
+      </w:pPr>
+      <w:r>
+        <w:t> Backend connecting to database</w:t>
+      </w:r>
+    </w:p>
+    <w:p>
+      <w:pPr>
+        <w:pStyle w:val="NormalWeb"/>
+        <w:spacing w:after="0"/>
+      </w:pPr>
+    </w:p>
+    <w:p>
+      <w:pPr>
+        <w:pStyle w:val="NormalWeb"/>
+        <w:spacing w:after="0"/>
+      </w:pPr>
+      <w:r>
+        <w:t>�� Submit:</w:t>
+      </w:r>
+    </w:p>
+    <w:p>
+      <w:pPr>
+        <w:pStyle w:val="NormalWeb"/>
+        <w:spacing w:before="0" w:beforeAutospacing="0" w:after="0" w:afterAutospacing="0"/>
+      </w:pPr>
+      <w:r>
+        <w:lastRenderedPageBreak/>
+        <w:drawing>
+          <wp:inline distT="0" distB="0" distL="0" distR="0" wp14:anchorId="4255EBE9" wp14:editId="37B04288">
+            <wp:extent cx="5943600" cy="4733925"/>
+            <wp:effectExtent l="0" t="0" r="0" b="9525"/>
+            <wp:docPr id="666527690" name="Picture 1" descr="A screenshot of a computer&#10;&#10;AI-generated content may be incorrect."/>
+            <wp:cNvGraphicFramePr>
+              <a:graphicFrameLocks xmlns:a="http://schemas.openxmlformats.org/drawingml/2006/main" noChangeAspect="1"/>
+            </wp:cNvGraphicFramePr>
+            <a:graphic xmlns:a="http://schemas.openxmlformats.org/drawingml/2006/main">
+              <a:graphicData uri="http://schemas.openxmlformats.org/drawingml/2006/picture">
+                <pic:pic xmlns:pic="http://schemas.openxmlformats.org/drawingml/2006/picture">
+                  <pic:nvPicPr>
+                    <pic:cNvPr id="666527690" name="Picture 1" descr="A screenshot of a computer&#10;&#10;AI-generated content may be incorrect."/>
+                    <pic:cNvPicPr/>
+                  </pic:nvPicPr>
+                  <pic:blipFill>
+                    <a:blip r:embed="rId13"/>
+                    <a:stretch>
+                      <a:fillRect/>
+                    </a:stretch>
+                  </pic:blipFill>
+                  <pic:spPr>
+                    <a:xfrm>
+                      <a:off x="0" y="0"/>
+                      <a:ext cx="5943600" cy="4733925"/>
+                    </a:xfrm>
+                    <a:prstGeom prst="rect">
+                      <a:avLst/>
+                    </a:prstGeom>
+                  </pic:spPr>
+                </pic:pic>
+              </a:graphicData>
+            </a:graphic>
+          </wp:inline>
+        </w:drawing>
+      </w:r>
+    </w:p>
+    <w:p>
+      <w:pPr>
+        <w:pStyle w:val="NormalWeb"/>
+        <w:spacing w:before="0" w:beforeAutospacing="0" w:after="0" w:afterAutospacing="0"/>
+      </w:pPr>
+      <w:r>
+        <w:lastRenderedPageBreak/>
+        <w:drawing>
+          <wp:inline distT="0" distB="0" distL="0" distR="0" wp14:anchorId="480BAFB0" wp14:editId="4C1489AE">
+            <wp:extent cx="5943600" cy="5949950"/>
+            <wp:effectExtent l="0" t="0" r="0" b="0"/>
+            <wp:docPr id="414378629" name="Picture 1"/>
+            <wp:cNvGraphicFramePr>
+              <a:graphicFrameLocks xmlns:a="http://schemas.openxmlformats.org/drawingml/2006/main" noChangeAspect="1"/>
+            </wp:cNvGraphicFramePr>
+            <a:graphic xmlns:a="http://schemas.openxmlformats.org/drawingml/2006/main">
+              <a:graphicData uri="http://schemas.openxmlformats.org/drawingml/2006/picture">
+                <pic:pic xmlns:pic="http://schemas.openxmlformats.org/drawingml/2006/picture">
+                  <pic:nvPicPr>
+                    <pic:cNvPr id="414378629" name=""/>
+                    <pic:cNvPicPr/>
+                  </pic:nvPicPr>
+                  <pic:blipFill>
+                    <a:blip r:embed="rId14"/>
+                    <a:stretch>
+                      <a:fillRect/>
+                    </a:stretch>
+                  </pic:blipFill>
+                  <pic:spPr>
+                    <a:xfrm>
+                      <a:off x="0" y="0"/>
+                      <a:ext cx="5943600" cy="5949950"/>
+                    </a:xfrm>
+                    <a:prstGeom prst="rect">
+                      <a:avLst/>
+                    </a:prstGeom>
+                  </pic:spPr>
+                </pic:pic>
+              </a:graphicData>
+            </a:graphic>
+          </wp:inline>
+        </w:drawing>
+      </w:r>
+    </w:p>
+    <w:p>
+      <w:pPr>
+        <w:pStyle w:val="NormalWeb"/>
+        <w:spacing w:before="0" w:beforeAutospacing="0" w:after="0" w:afterAutospacing="0"/>
+      </w:pPr>
+      <w:r>
+        <w:drawing>
+          <wp:inline distT="0" distB="0" distL="0" distR="0" wp14:anchorId="6E1B2CD9" wp14:editId="4BEC046C">
+            <wp:extent cx="5943600" cy="1450340"/>
+            <wp:effectExtent l="0" t="0" r="0" b="0"/>
+            <wp:docPr id="1233509845" name="Picture 1" descr="A screenshot of a computer program&#10;&#10;AI-generated content may be incorrect."/>
+            <wp:cNvGraphicFramePr>
+              <a:graphicFrameLocks xmlns:a="http://schemas.openxmlformats.org/drawingml/2006/main" noChangeAspect="1"/>
+            </wp:cNvGraphicFramePr>
+            <a:graphic xmlns:a="http://schemas.openxmlformats.org/drawingml/2006/main">
+              <a:graphicData uri="http://schemas.openxmlformats.org/drawingml/2006/picture">
+                <pic:pic xmlns:pic="http://schemas.openxmlformats.org/drawingml/2006/picture">
+                  <pic:nvPicPr>
+                    <pic:cNvPr id="1233509845" name="Picture 1" descr="A screenshot of a computer program&#10;&#10;AI-generated content may be incorrect."/>
+                    <pic:cNvPicPr/>
+                  </pic:nvPicPr>
+                  <pic:blipFill>
+                    <a:blip r:embed="rId15"/>
+                    <a:stretch>
+                      <a:fillRect/>
+                    </a:stretch>
+                  </pic:blipFill>
+                  <pic:spPr>
+                    <a:xfrm>
+                      <a:off x="0" y="0"/>
+                      <a:ext cx="5943600" cy="1450340"/>
+                    </a:xfrm>
+                    <a:prstGeom prst="rect">
+                      <a:avLst/>
+                    </a:prstGeom>
+                  </pic:spPr>
+                </pic:pic>
+              </a:graphicData>
+            </a:graphic>
+          </wp:inline>
+        </w:drawing>
+      </w:r>
+    </w:p>
+    <w:p>
+      <w:pPr>
+        <w:pStyle w:val="NormalWeb"/>
+        <w:spacing w:before="0" w:beforeAutospacing="0" w:after="0" w:afterAutospacing="0"/>
+      </w:pPr>
+      <w:r>
+        <w:lastRenderedPageBreak/>
+        <w:drawing>
+          <wp:inline distT="0" distB="0" distL="0" distR="0" wp14:anchorId="4B5AE94C" wp14:editId="34C9C90A">
+            <wp:extent cx="5943600" cy="3856355"/>
+            <wp:effectExtent l="0" t="0" r="0" b="0"/>
+            <wp:docPr id="338633664" name="Picture 1"/>
+            <wp:cNvGraphicFramePr>
+              <a:graphicFrameLocks xmlns:a="http://schemas.openxmlformats.org/drawingml/2006/main" noChangeAspect="1"/>
+            </wp:cNvGraphicFramePr>
+            <a:graphic xmlns:a="http://schemas.openxmlformats.org/drawingml/2006/main">
+              <a:graphicData uri="http://schemas.openxmlformats.org/drawingml/2006/picture">
+                <pic:pic xmlns:pic="http://schemas.openxmlformats.org/drawingml/2006/picture">
+                  <pic:nvPicPr>
+                    <pic:cNvPr id="338633664" name=""/>
+                    <pic:cNvPicPr/>
+                  </pic:nvPicPr>
+                  <pic:blipFill>
+                    <a:blip r:embed="rId16"/>
+                    <a:stretch>
+                      <a:fillRect/>
+                    </a:stretch>
+                  </pic:blipFill>
+                  <pic:spPr>
+                    <a:xfrm>
+                      <a:off x="0" y="0"/>
+                      <a:ext cx="5943600" cy="3856355"/>
+                    </a:xfrm>
+                    <a:prstGeom prst="rect">
+                      <a:avLst/>
+                    </a:prstGeom>
+                  </pic:spPr>
+                </pic:pic>
+              </a:graphicData>
+            </a:graphic>
+          </wp:inline>
+        </w:drawing>
+      </w:r>
+    </w:p>
+    <w:p>
+      <w:pPr>
+        <w:pStyle w:val="NormalWeb"/>
+        <w:spacing w:before="0" w:beforeAutospacing="0" w:after="0" w:afterAutospacing="0"/>
+      </w:pPr>
+    </w:p>
+    <w:p>
+      <w:pPr>
+        <w:pStyle w:val="NormalWeb"/>
+        <w:spacing w:before="0" w:beforeAutospacing="0" w:after="0" w:afterAutospacing="0"/>
+      </w:pPr>
+    </w:p>
+    <w:p>
+      <w:pPr>
+        <w:pStyle w:val="NormalWeb"/>
+        <w:spacing w:before="0" w:beforeAutospacing="0" w:after="0" w:afterAutospacing="0"/>
+      </w:pPr>
+    </w:p>
+    <w:p>
+      <w:pPr>
+        <w:pStyle w:val="NormalWeb"/>
+        <w:spacing w:before="0" w:beforeAutospacing="0" w:after="0" w:afterAutospacing="0"/>
+      </w:pPr>
+    </w:p>
+    <w:p>
+      <w:pPr>
+        <w:pStyle w:val="NormalWeb"/>
+        <w:spacing w:before="0" w:beforeAutospacing="0" w:after="0" w:afterAutospacing="0"/>
+      </w:pPr>
+    </w:p>
+    <w:p>
+      <w:pPr>
+        <w:pStyle w:val="NormalWeb"/>
+        <w:spacing w:before="0" w:beforeAutospacing="0" w:after="0" w:afterAutospacing="0"/>
+      </w:pPr>
+    </w:p>
+    <w:p>
+      <w:pPr>
+        <w:pStyle w:val="NormalWeb"/>
+        <w:spacing w:before="0" w:beforeAutospacing="0" w:after="0" w:afterAutospacing="0"/>
+      </w:pPr>
+    </w:p>
+    <w:p>
+      <w:pPr>
+        <w:pStyle w:val="NormalWeb"/>
+        <w:spacing w:before="0" w:beforeAutospacing="0" w:after="0" w:afterAutospacing="0"/>
+      </w:pPr>
+    </w:p>
+    <w:p>
+      <w:pPr>
+        <w:pStyle w:val="NormalWeb"/>
+        <w:spacing w:before="0" w:beforeAutospacing="0" w:after="0" w:afterAutospacing="0"/>
+      </w:pPr>
+    </w:p>
+    <w:p>
+      <w:pPr>
+        <w:pStyle w:val="NormalWeb"/>
+        <w:spacing w:before="0" w:beforeAutospacing="0" w:after="0" w:afterAutospacing="0"/>
+      </w:pPr>
+    </w:p>
+    <w:p>
+      <w:pPr>
+        <w:pStyle w:val="NormalWeb"/>
+        <w:spacing w:before="0" w:beforeAutospacing="0" w:after="0" w:afterAutospacing="0"/>
+      </w:pPr>
+    </w:p>
+    <w:p>
+      <w:pPr>
+        <w:pStyle w:val="NormalWeb"/>
+        <w:spacing w:before="0" w:beforeAutospacing="0" w:after="0" w:afterAutospacing="0"/>
+      </w:pPr>
+    </w:p>
+    <w:p>
+      <w:pPr>
+        <w:pStyle w:val="NormalWeb"/>
+        <w:spacing w:before="0" w:beforeAutospacing="0" w:after="0" w:afterAutospacing="0"/>
+      </w:pPr>
+    </w:p>
+    <w:p>
+      <w:pPr>
+        <w:pStyle w:val="NormalWeb"/>
+        <w:spacing w:before="0" w:beforeAutospacing="0" w:after="0" w:afterAutospacing="0"/>
+      </w:pPr>
+    </w:p>
+    <w:p>
+      <w:pPr>
+        <w:pStyle w:val="NormalWeb"/>
+        <w:spacing w:before="0" w:beforeAutospacing="0" w:after="0" w:afterAutospacing="0"/>
+      </w:pPr>
+    </w:p>
+    <w:p>
+      <w:pPr>
+        <w:pStyle w:val="NormalWeb"/>
+        <w:spacing w:before="0" w:beforeAutospacing="0" w:after="0" w:afterAutospacing="0"/>
+      </w:pPr>
+    </w:p>
+    <w:p>
+      <w:pPr>
+        <w:pStyle w:val="NormalWeb"/>
+        <w:spacing w:before="0" w:beforeAutospacing="0" w:after="0" w:afterAutospacing="0"/>
+      </w:pPr>
+    </w:p>
+    <w:p>
+      <w:pPr>
+        <w:pStyle w:val="NormalWeb"/>
+        <w:spacing w:before="0" w:beforeAutospacing="0" w:after="0" w:afterAutospacing="0"/>
+      </w:pPr>
+    </w:p>
+    <w:p>
+      <w:pPr>
+        <w:pStyle w:val="NormalWeb"/>
+        <w:spacing w:before="0" w:beforeAutospacing="0" w:after="0" w:afterAutospacing="0"/>
+      </w:pPr>
+    </w:p>
+    <w:p>
+      <w:pPr>
+        <w:pStyle w:val="NormalWeb"/>
+        <w:spacing w:before="0" w:beforeAutospacing="0" w:after="0" w:afterAutospacing="0"/>
+      </w:pPr>
+    </w:p>
+    <w:p>
+      <w:pPr>
+        <w:pStyle w:val="NormalWeb"/>
+        <w:spacing w:before="0" w:beforeAutospacing="0" w:after="0" w:afterAutospacing="0"/>
+      </w:pPr>
+    </w:p>
+    <w:p>
+      <w:pPr>
+        <w:pStyle w:val="NormalWeb"/>
+        <w:spacing w:before="0" w:beforeAutospacing="0" w:after="0" w:afterAutospacing="0"/>
+      </w:pPr>
+    </w:p>
+    <w:p>
+      <w:pPr>
+        <w:pStyle w:val="NormalWeb"/>
+        <w:spacing w:before="0" w:beforeAutospacing="0" w:after="0" w:afterAutospacing="0"/>
+      </w:pPr>
+    </w:p>
+    <w:p>
+      <w:pPr>
+        <w:pStyle w:val="NormalWeb"/>
+        <w:spacing w:before="0" w:beforeAutospacing="0" w:after="0" w:afterAutospacing="0"/>
+      </w:pPr>
+    </w:p>
+    <w:p>
+      <w:pPr>
+        <w:pStyle w:val="Heading1"/>
+      </w:pPr>
+      <w:r>
+        <w:lastRenderedPageBreak/>
+        <w:t>SECTION D: CONFIGURATION MANAGEMENT USING ANSIBLE (8 Marks)</w:t>
+      </w:r>
+    </w:p>
+    <w:p>
+      <w:pPr>
+        <w:pStyle w:val="NormalWeb"/>
+        <w:spacing w:after="0"/>
+      </w:pPr>
+      <w:r>
+        <w:t>Use Ansible to configure at least two servers or two separate roles.</w:t>
+      </w:r>
+    </w:p>
+    <w:p>
+      <w:pPr>
+        <w:pStyle w:val="NormalWeb"/>
+        <w:spacing w:after="0"/>
+      </w:pPr>
+      <w:r>
+        <w:t>Task D1: Inventory Setup</w:t>
+      </w:r>
+    </w:p>
+    <w:p>
+      <w:pPr>
+        <w:pStyle w:val="NormalWeb"/>
+        <w:spacing w:after="0"/>
+      </w:pPr>
+      <w:r>
+        <w:t>Create an inventory describing your target machines.</w:t>
+      </w:r>
+    </w:p>
+    <w:p>
+      <w:pPr>
+        <w:pStyle w:val="NormalWeb"/>
+        <w:spacing w:after="0"/>
+      </w:pPr>
+      <w:r>
+        <w:t>Task D2: Playbook</w:t>
+      </w:r>
+    </w:p>
+    <w:p>
+      <w:pPr>
+        <w:pStyle w:val="NormalWeb"/>
+        <w:spacing w:after="0"/>
+      </w:pPr>
+      <w:r>
+        <w:t>Your playbook should automate:</w:t>
+      </w:r>
+    </w:p>
+    <w:p>
+      <w:pPr>
+        <w:pStyle w:val="NormalWeb"/>
+        <w:spacing w:after="0"/>
+      </w:pPr>
+      <w:r>
+        <w:t> Installation of required software (e.g., Docker, Node, Nginx, Python, etc.)</w:t>
+      </w:r>
+    </w:p>
+    <w:p>
+      <w:pPr>
+        <w:pStyle w:val="NormalWeb"/>
+        <w:spacing w:after="0"/>
+      </w:pPr>
+      <w:r>
+        <w:t> Basic configuration or service preparation</w:t>
+      </w:r>
+    </w:p>
+    <w:p>
+      <w:pPr>
+        <w:pStyle w:val="NormalWeb"/>
+        <w:spacing w:after="0"/>
+      </w:pPr>
+      <w:r>
+        <w:t>�� Submit:</w:t>
+      </w:r>
+    </w:p>
+    <w:p>
+      <w:pPr>
+        <w:pStyle w:val="NormalWeb"/>
+        <w:spacing w:after="0"/>
+      </w:pPr>
+      <w:r>
+        <w:t> playbook.yml</w:t>
+      </w:r>
+    </w:p>
+    <w:p>
+      <w:pPr>
+        <w:pStyle w:val="NormalWeb"/>
+        <w:spacing w:after="0"/>
+      </w:pPr>
+      <w:r>
+        <w:t> hosts.ini</w:t>
+      </w:r>
+    </w:p>
+    <w:p>
+      <w:pPr>
+        <w:pStyle w:val="NormalWeb"/>
+        <w:spacing w:before="0" w:beforeAutospacing="0" w:after="0" w:afterAutospacing="0"/>
+      </w:pPr>
+      <w:r>
+        <w:t> Screenshot of successful playbook execution</w:t>
+      </w:r>
+      <w:r>
+        <w:br/>
+      </w:r>
+    </w:p>
+    <w:p>
+      <w:pPr>
+        <w:pStyle w:val="NormalWeb"/>
+        <w:spacing w:before="0" w:beforeAutospacing="0" w:after="0" w:afterAutospacing="0"/>
+      </w:pPr>
+      <w:r>
+        <w:lastRenderedPageBreak/>
+        <w:drawing>
+          <wp:inline distT="0" distB="0" distL="0" distR="0" wp14:anchorId="1C484185" wp14:editId="2E3AA70B">
+            <wp:extent cx="5943600" cy="2748280"/>
+            <wp:effectExtent l="0" t="0" r="0" b="0"/>
+            <wp:docPr id="1663297269" name="Picture 1" descr="A screenshot of a computer program&#10;&#10;AI-generated content may be incorrect."/>
+            <wp:cNvGraphicFramePr>
+              <a:graphicFrameLocks xmlns:a="http://schemas.openxmlformats.org/drawingml/2006/main" noChangeAspect="1"/>
+            </wp:cNvGraphicFramePr>
+            <a:graphic xmlns:a="http://schemas.openxmlformats.org/drawingml/2006/main">
+              <a:graphicData uri="http://schemas.openxmlformats.org/drawingml/2006/picture">
+                <pic:pic xmlns:pic="http://schemas.openxmlformats.org/drawingml/2006/picture">
+                  <pic:nvPicPr>
+                    <pic:cNvPr id="1663297269" name="Picture 1" descr="A screenshot of a computer program&#10;&#10;AI-generated content may be incorrect."/>
+                    <pic:cNvPicPr/>
+                  </pic:nvPicPr>
+                  <pic:blipFill>
+                    <a:blip r:embed="rId17"/>
+                    <a:stretch>
+                      <a:fillRect/>
+                    </a:stretch>
+                  </pic:blipFill>
+                  <pic:spPr>
+                    <a:xfrm>
+                      <a:off x="0" y="0"/>
+                      <a:ext cx="5943600" cy="2748280"/>
+                    </a:xfrm>
+                    <a:prstGeom prst="rect">
+                      <a:avLst/>
+                    </a:prstGeom>
+                  </pic:spPr>
+                </pic:pic>
+              </a:graphicData>
+            </a:graphic>
+          </wp:inline>
+        </w:drawing>
+      </w:r>
+      <w:r>
+        <w:br/>
+      </w:r>
+      <w:r>
+        <w:drawing>
+          <wp:inline distT="0" distB="0" distL="0" distR="0" wp14:anchorId="474CFFE6" wp14:editId="3CF42A24">
+            <wp:extent cx="5943600" cy="2287905"/>
+            <wp:effectExtent l="0" t="0" r="0" b="0"/>
+            <wp:docPr id="621590647" name="Picture 1"/>
+            <wp:cNvGraphicFramePr>
+              <a:graphicFrameLocks xmlns:a="http://schemas.openxmlformats.org/drawingml/2006/main" noChangeAspect="1"/>
+            </wp:cNvGraphicFramePr>
+            <a:graphic xmlns:a="http://schemas.openxmlformats.org/drawingml/2006/main">
+              <a:graphicData uri="http://schemas.openxmlformats.org/drawingml/2006/picture">
+                <pic:pic xmlns:pic="http://schemas.openxmlformats.org/drawingml/2006/picture">
+                  <pic:nvPicPr>
+                    <pic:cNvPr id="621590647" name=""/>
+                    <pic:cNvPicPr/>
+                  </pic:nvPicPr>
+                  <pic:blipFill>
+                    <a:blip r:embed="rId18"/>
+                    <a:stretch>
+                      <a:fillRect/>
+                    </a:stretch>
+                  </pic:blipFill>
+                  <pic:spPr>
+                    <a:xfrm>
+                      <a:off x="0" y="0"/>
+                      <a:ext cx="5943600" cy="2287905"/>
+                    </a:xfrm>
+                    <a:prstGeom prst="rect">
+                      <a:avLst/>
+                    </a:prstGeom>
+                  </pic:spPr>
+                </pic:pic>
+              </a:graphicData>
+            </a:graphic>
+          </wp:inline>
+        </w:drawing>
+      </w:r>
+    </w:p>
+    <w:p>
+      <w:pPr>
+        <w:pStyle w:val="NormalWeb"/>
+        <w:spacing w:before="0" w:beforeAutospacing="0" w:after="0" w:afterAutospacing="0"/>
+      </w:pPr>
+    </w:p>
+    <w:p>
+      <w:pPr>
+        <w:pStyle w:val="NormalWeb"/>
+        <w:spacing w:before="0" w:beforeAutospacing="0" w:after="0" w:afterAutospacing="0"/>
+      </w:pPr>
+    </w:p>
+    <w:p>
+      <w:pPr>
+        <w:pStyle w:val="NormalWeb"/>
+        <w:spacing w:before="0" w:beforeAutospacing="0" w:after="0" w:afterAutospacing="0"/>
+      </w:pPr>
+    </w:p>
+    <w:p>
+      <w:pPr>
+        <w:pStyle w:val="NormalWeb"/>
+        <w:spacing w:before="0" w:beforeAutospacing="0" w:after="0" w:afterAutospacing="0"/>
+      </w:pPr>
+    </w:p>
+    <w:p>
+      <w:pPr>
+        <w:pStyle w:val="NormalWeb"/>
+        <w:spacing w:before="0" w:beforeAutospacing="0" w:after="0" w:afterAutospacing="0"/>
+      </w:pPr>
+    </w:p>
+    <w:p>
+      <w:pPr>
+        <w:pStyle w:val="NormalWeb"/>
+        <w:spacing w:before="0" w:beforeAutospacing="0" w:after="0" w:afterAutospacing="0"/>
+      </w:pPr>
+    </w:p>
+    <w:p>
+      <w:pPr>
+        <w:pStyle w:val="NormalWeb"/>
+        <w:spacing w:before="0" w:beforeAutospacing="0" w:after="0" w:afterAutospacing="0"/>
+      </w:pPr>
+    </w:p>
+    <w:p>
+      <w:pPr>
+        <w:pStyle w:val="NormalWeb"/>
+        <w:spacing w:before="0" w:beforeAutospacing="0" w:after="0" w:afterAutospacing="0"/>
+      </w:pPr>
+    </w:p>
+    <w:p>
+      <w:pPr>
+        <w:pStyle w:val="NormalWeb"/>
+        <w:spacing w:before="0" w:beforeAutospacing="0" w:after="0" w:afterAutospacing="0"/>
+      </w:pPr>
+    </w:p>
+    <w:p>
+      <w:pPr>
+        <w:pStyle w:val="NormalWeb"/>
+        <w:spacing w:before="0" w:beforeAutospacing="0" w:after="0" w:afterAutospacing="0"/>
+      </w:pPr>
+    </w:p>
+    <w:p>
+      <w:pPr>
+        <w:pStyle w:val="NormalWeb"/>
+        <w:spacing w:before="0" w:beforeAutospacing="0" w:after="0" w:afterAutospacing="0"/>
+      </w:pPr>
+    </w:p>
+    <w:p>
+      <w:pPr>
+        <w:pStyle w:val="NormalWeb"/>
+        <w:spacing w:before="0" w:beforeAutospacing="0" w:after="0" w:afterAutospacing="0"/>
+      </w:pPr>
+    </w:p>
+    <w:p>
+      <w:pPr>
+        <w:pStyle w:val="NormalWeb"/>
+        <w:spacing w:before="0" w:beforeAutospacing="0" w:after="0" w:afterAutospacing="0"/>
+      </w:pPr>
+    </w:p>
+    <w:p>
+      <w:pPr>
+        <w:pStyle w:val="NormalWeb"/>
+        <w:spacing w:before="0" w:beforeAutospacing="0" w:after="0" w:afterAutospacing="0"/>
+      </w:pPr>
+    </w:p>
+    <w:p>
+      <w:pPr>
+        <w:pStyle w:val="NormalWeb"/>
+        <w:spacing w:before="0" w:beforeAutospacing="0" w:after="0" w:afterAutospacing="0"/>
+      </w:pPr>
+    </w:p>
+    <w:p>
+      <w:pPr>
+        <w:pStyle w:val="NormalWeb"/>
+        <w:spacing w:before="0" w:beforeAutospacing="0" w:after="0" w:afterAutospacing="0"/>
+      </w:pPr>
+    </w:p>
+    <w:p>
+      <w:pPr>
+        <w:pStyle w:val="NormalWeb"/>
+        <w:spacing w:before="0" w:beforeAutospacing="0" w:after="0" w:afterAutospacing="0"/>
+      </w:pPr>
+    </w:p>
+    <w:p>
+      <w:pPr>
+        <w:pStyle w:val="NormalWeb"/>
+        <w:spacing w:before="0" w:beforeAutospacing="0" w:after="0" w:afterAutospacing="0"/>
+      </w:pPr>
+    </w:p>
+    <w:p>
+      <w:pPr>
+        <w:pStyle w:val="NormalWeb"/>
+        <w:spacing w:after="0"/>
+      </w:pPr>
+      <w:r>
+        <w:lastRenderedPageBreak/>
+        <w:t>SECTION E: SELENIUM AUTOMATED TESTING (6 Marks)</w:t>
+      </w:r>
+    </w:p>
+    <w:p>
+      <w:pPr>
+        <w:pStyle w:val="NormalWeb"/>
+        <w:spacing w:after="0"/>
+      </w:pPr>
+      <w:r>
+        <w:t>Develop Selenium test cases for your application.</w:t>
+      </w:r>
+    </w:p>
+    <w:p>
+      <w:pPr>
+        <w:pStyle w:val="NormalWeb"/>
+        <w:spacing w:after="0"/>
+      </w:pPr>
+      <w:r>
+        <w:t>Task E1: Test Cases (Minimum 3)</w:t>
+      </w:r>
+    </w:p>
+    <w:p>
+      <w:pPr>
+        <w:pStyle w:val="NormalWeb"/>
+        <w:spacing w:after="0"/>
+      </w:pPr>
+      <w:r>
+        <w:t>Examples (choose any relevant to your project):</w:t>
+      </w:r>
+    </w:p>
+    <w:p>
+      <w:pPr>
+        <w:pStyle w:val="NormalWeb"/>
+        <w:spacing w:after="0"/>
+      </w:pPr>
+      <w:r>
+        <w:t> Verify homepage loads</w:t>
+      </w:r>
+    </w:p>
+    <w:p>
+      <w:pPr>
+        <w:pStyle w:val="NormalWeb"/>
+        <w:spacing w:after="0"/>
+      </w:pPr>
+      <w:r>
+        <w:t> Validate login or form behavior</w:t>
+      </w:r>
+    </w:p>
+    <w:p>
+      <w:pPr>
+        <w:pStyle w:val="NormalWeb"/>
+        <w:spacing w:after="0"/>
+      </w:pPr>
+      <w:r>
+        <w:t> Check frontend-to-backend API response</w:t>
+      </w:r>
+    </w:p>
+    <w:p>
+      <w:pPr>
+        <w:pStyle w:val="NormalWeb"/>
+        <w:spacing w:after="0"/>
+      </w:pPr>
+      <w:r>
+        <w:t> Validate navigation or button behavior</w:t>
+      </w:r>
+    </w:p>
+    <w:p>
+      <w:pPr>
+        <w:pStyle w:val="NormalWeb"/>
+        <w:spacing w:after="0"/>
+      </w:pPr>
+      <w:r>
+        <w:t>Task E2: Execution Report</w:t>
+      </w:r>
+    </w:p>
+    <w:p>
+      <w:pPr>
+        <w:pStyle w:val="NormalWeb"/>
+        <w:spacing w:after="0"/>
+      </w:pPr>
+      <w:r>
+        <w:t>Include the code and test execution screenshots.</w:t>
+      </w:r>
+    </w:p>
+    <w:p>
+      <w:pPr>
+        <w:pStyle w:val="NormalWeb"/>
+        <w:spacing w:after="0"/>
+      </w:pPr>
+      <w:r>
+        <w:t>�� Submit:</w:t>
+      </w:r>
+    </w:p>
+    <w:p>
+      <w:pPr>
+        <w:pStyle w:val="NormalWeb"/>
+        <w:spacing w:before="0" w:beforeAutospacing="0" w:after="0" w:afterAutospacing="0"/>
+      </w:pPr>
+      <w:r>
+        <w:drawing>
+          <wp:inline distT="0" distB="0" distL="0" distR="0" wp14:anchorId="37A81D67" wp14:editId="1C10AED7">
+            <wp:extent cx="3896269" cy="1438476"/>
+            <wp:effectExtent l="0" t="0" r="9525" b="9525"/>
+            <wp:docPr id="140522614" name="Picture 1" descr="A screen shot of a computer&#10;&#10;AI-generated content may be incorrect."/>
+            <wp:cNvGraphicFramePr>
+              <a:graphicFrameLocks xmlns:a="http://schemas.openxmlformats.org/drawingml/2006/main" noChangeAspect="1"/>
+            </wp:cNvGraphicFramePr>
+            <a:graphic xmlns:a="http://schemas.openxmlformats.org/drawingml/2006/main">
+              <a:graphicData uri="http://schemas.openxmlformats.org/drawingml/2006/picture">
+                <pic:pic xmlns:pic="http://schemas.openxmlformats.org/drawingml/2006/picture">
+                  <pic:nvPicPr>
+                    <pic:cNvPr id="140522614" name="Picture 1" descr="A screen shot of a computer&#10;&#10;AI-generated content may be incorrect."/>
+                    <pic:cNvPicPr/>
+                  </pic:nvPicPr>
+                  <pic:blipFill>
+                    <a:blip r:embed="rId19"/>
+                    <a:stretch>
+                      <a:fillRect/>
+                    </a:stretch>
+                  </pic:blipFill>
+                  <pic:spPr>
+                    <a:xfrm>
+                      <a:off x="0" y="0"/>
+                      <a:ext cx="3896269" cy="1438476"/>
+                    </a:xfrm>
+                    <a:prstGeom prst="rect">
+                      <a:avLst/>
+                    </a:prstGeom>
+                  </pic:spPr>
+                </pic:pic>
+              </a:graphicData>
+            </a:graphic>
+          </wp:inline>
+        </w:drawing>
+      </w:r>
     </w:p>
     <w:sectPr>
       <w:pgSz w:w="12240" w:h="15840"/>
@@ -600,6 +2094,56 @@
     </w:sectPr>
   </w:body>
 </w:document>
+</file>
+
+<file path=word/endnotes.xml><?xml version="1.0" encoding="utf-8"?>
+<w:endnotes xmlns:wpc="http://schemas.microsoft.com/office/word/2010/wordprocessingCanvas" xmlns:cx="http://schemas.microsoft.com/office/drawing/2014/chartex" xmlns:cx1="http://schemas.microsoft.com/office/drawing/2015/9/8/chartex" xmlns:cx2="http://schemas.microsoft.com/office/drawing/2015/10/21/chartex" xmlns:cx3="http://schemas.microsoft.com/office/drawing/2016/5/9/chartex" xmlns:cx4="http://schemas.microsoft.com/office/drawing/2016/5/10/chartex" xmlns:cx5="http://schemas.microsoft.com/office/drawing/2016/5/11/chartex" xmlns:cx6="http://schemas.microsoft.com/office/drawing/2016/5/12/chartex" xmlns:cx7="http://schemas.microsoft.com/office/drawing/2016/5/13/chartex" xmlns:cx8="http://schemas.microsoft.com/office/drawing/2016/5/14/chartex" xmlns:mc="http://schemas.openxmlformats.org/markup-compatibility/2006" xmlns:aink="http://schemas.microsoft.com/office/drawing/2016/ink" xmlns:am3d="http://schemas.microsoft.com/office/drawing/2017/model3d" xmlns:o="urn:schemas-microsoft-com:office:office" xmlns:oel="http://schemas.microsoft.com/office/2019/extlst" xmlns:r="http://schemas.openxmlformats.org/officeDocument/2006/relationships" xmlns:m="http://schemas.openxmlformats.org/officeDocument/2006/math" xmlns:v="urn:schemas-microsoft-com:vml" xmlns:wp14="http://schemas.microsoft.com/office/word/2010/wordprocessingDrawing" xmlns:wp="http://schemas.openxmlformats.org/drawingml/2006/wordprocessingDrawing" xmlns:w10="urn:schemas-microsoft-com:office:word" xmlns:w="http://schemas.openxmlformats.org/wordprocessingml/2006/main" xmlns:w14="http://schemas.microsoft.com/office/word/2010/wordml" xmlns:w15="http://schemas.microsoft.com/office/word/2012/wordml" xmlns:w16cex="http://schemas.microsoft.com/office/word/2018/wordml/cex" xmlns:w16cid="http://schemas.microsoft.com/office/word/2016/wordml/cid" xmlns:w16="http://schemas.microsoft.com/office/word/2018/wordml" xmlns:w16du="http://schemas.microsoft.com/office/word/2023/wordml/word16du" xmlns:w16sdtdh="http://schemas.microsoft.com/office/word/2020/wordml/sdtdatahash" xmlns:w16sdtfl="http://schemas.microsoft.com/office/word/2024/wordml/sdtformatlock" xmlns:w16se="http://schemas.microsoft.com/office/word/2015/wordml/symex" xmlns:wpg="http://schemas.microsoft.com/office/word/2010/wordprocessingGroup" xmlns:wpi="http://schemas.microsoft.com/office/word/2010/wordprocessingInk" xmlns:wne="http://schemas.microsoft.com/office/word/2006/wordml" xmlns:wps="http://schemas.microsoft.com/office/word/2010/wordprocessingShape" mc:Ignorable="w14 w15 w16se w16cid w16 w16cex w16sdtdh w16sdtfl w16du wp14">
+  <w:endnote w:type="separator" w:id="-1">
+    <w:p>
+      <w:pPr>
+        <w:spacing w:after="0" w:line="240" w:lineRule="auto"/>
+      </w:pPr>
+      <w:r>
+        <w:separator/>
+      </w:r>
+    </w:p>
+  </w:endnote>
+  <w:endnote w:type="continuationSeparator" w:id="0">
+    <w:p>
+      <w:pPr>
+        <w:spacing w:after="0" w:line="240" w:lineRule="auto"/>
+      </w:pPr>
+      <w:r>
+        <w:continuationSeparator/>
+      </w:r>
+    </w:p>
+  </w:endnote>
+</w:endnotes>
+</file>
+
+<file path=word/footnotes.xml><?xml version="1.0" encoding="utf-8"?>
+<w:footnotes xmlns:wpc="http://schemas.microsoft.com/office/word/2010/wordprocessingCanvas" xmlns:cx="http://schemas.microsoft.com/office/drawing/2014/chartex" xmlns:cx1="http://schemas.microsoft.com/office/drawing/2015/9/8/chartex" xmlns:cx2="http://schemas.microsoft.com/office/drawing/2015/10/21/chartex" xmlns:cx3="http://schemas.microsoft.com/office/drawing/2016/5/9/chartex" xmlns:cx4="http://schemas.microsoft.com/office/drawing/2016/5/10/chartex" xmlns:cx5="http://schemas.microsoft.com/office/drawing/2016/5/11/chartex" xmlns:cx6="http://schemas.microsoft.com/office/drawing/2016/5/12/chartex" xmlns:cx7="http://schemas.microsoft.com/office/drawing/2016/5/13/chartex" xmlns:cx8="http://schemas.microsoft.com/office/drawing/2016/5/14/chartex" xmlns:mc="http://schemas.openxmlformats.org/markup-compatibility/2006" xmlns:aink="http://schemas.microsoft.com/office/drawing/2016/ink" xmlns:am3d="http://schemas.microsoft.com/office/drawing/2017/model3d" xmlns:o="urn:schemas-microsoft-com:office:office" xmlns:oel="http://schemas.microsoft.com/office/2019/extlst" xmlns:r="http://schemas.openxmlformats.org/officeDocument/2006/relationships" xmlns:m="http://schemas.openxmlformats.org/officeDocument/2006/math" xmlns:v="urn:schemas-microsoft-com:vml" xmlns:wp14="http://schemas.microsoft.com/office/word/2010/wordprocessingDrawing" xmlns:wp="http://schemas.openxmlformats.org/drawingml/2006/wordprocessingDrawing" xmlns:w10="urn:schemas-microsoft-com:office:word" xmlns:w="http://schemas.openxmlformats.org/wordprocessingml/2006/main" xmlns:w14="http://schemas.microsoft.com/office/word/2010/wordml" xmlns:w15="http://schemas.microsoft.com/office/word/2012/wordml" xmlns:w16cex="http://schemas.microsoft.com/office/word/2018/wordml/cex" xmlns:w16cid="http://schemas.microsoft.com/office/word/2016/wordml/cid" xmlns:w16="http://schemas.microsoft.com/office/word/2018/wordml" xmlns:w16du="http://schemas.microsoft.com/office/word/2023/wordml/word16du" xmlns:w16sdtdh="http://schemas.microsoft.com/office/word/2020/wordml/sdtdatahash" xmlns:w16sdtfl="http://schemas.microsoft.com/office/word/2024/wordml/sdtformatlock" xmlns:w16se="http://schemas.microsoft.com/office/word/2015/wordml/symex" xmlns:wpg="http://schemas.microsoft.com/office/word/2010/wordprocessingGroup" xmlns:wpi="http://schemas.microsoft.com/office/word/2010/wordprocessingInk" xmlns:wne="http://schemas.microsoft.com/office/word/2006/wordml" xmlns:wps="http://schemas.microsoft.com/office/word/2010/wordprocessingShape" mc:Ignorable="w14 w15 w16se w16cid w16 w16cex w16sdtdh w16sdtfl w16du wp14">
+  <w:footnote w:type="separator" w:id="-1">
+    <w:p>
+      <w:pPr>
+        <w:spacing w:after="0" w:line="240" w:lineRule="auto"/>
+      </w:pPr>
+      <w:r>
+        <w:separator/>
+      </w:r>
+    </w:p>
+  </w:footnote>
+  <w:footnote w:type="continuationSeparator" w:id="0">
+    <w:p>
+      <w:pPr>
+        <w:spacing w:after="0" w:line="240" w:lineRule="auto"/>
+      </w:pPr>
+      <w:r>
+        <w:continuationSeparator/>
+      </w:r>
+    </w:p>
+  </w:footnote>
+</w:footnotes>
 </file>
 
 <file path=word/styles.xml><?xml version="1.0" encoding="utf-8"?>
@@ -1001,6 +2545,27 @@
     <w:name w:val="Normal"/>
     <w:qFormat/>
   </w:style>
+  <w:style w:type="paragraph" w:styleId="Heading1">
+    <w:name w:val="heading 1"/>
+    <w:basedOn w:val="Normal"/>
+    <w:next w:val="Normal"/>
+    <w:link w:val="Heading1Char"/>
+    <w:uiPriority w:val="9"/>
+    <w:qFormat/>
+    <w:rsid w:val="002114D6"/>
+    <w:pPr>
+      <w:keepNext/>
+      <w:keepLines/>
+      <w:spacing w:before="240" w:after="0"/>
+      <w:outlineLvl w:val="0"/>
+    </w:pPr>
+    <w:rPr>
+      <w:rFonts w:asciiTheme="majorHAnsi" w:eastAsiaTheme="majorEastAsia" w:hAnsiTheme="majorHAnsi" w:cstheme="majorBidi"/>
+      <w:color w:val="2F5496" w:themeColor="accent1" w:themeShade="BF"/>
+      <w:sz w:val="32"/>
+      <w:szCs w:val="32"/>
+    </w:rPr>
+  </w:style>
   <w:style w:type="character" w:default="1" w:styleId="DefaultParagraphFont">
     <w:name w:val="Default Paragraph Font"/>
     <w:uiPriority w:val="1"/>
@@ -1065,6 +2630,63 @@
       <w:sz w:val="24"/>
       <w:szCs w:val="24"/>
     </w:rPr>
+  </w:style>
+  <w:style w:type="character" w:customStyle="1" w:styleId="Heading1Char">
+    <w:name w:val="Heading 1 Char"/>
+    <w:basedOn w:val="DefaultParagraphFont"/>
+    <w:link w:val="Heading1"/>
+    <w:uiPriority w:val="9"/>
+    <w:rsid w:val="002114D6"/>
+    <w:rPr>
+      <w:rFonts w:asciiTheme="majorHAnsi" w:eastAsiaTheme="majorEastAsia" w:hAnsiTheme="majorHAnsi" w:cstheme="majorBidi"/>
+      <w:color w:val="2F5496" w:themeColor="accent1" w:themeShade="BF"/>
+      <w:sz w:val="32"/>
+      <w:szCs w:val="32"/>
+    </w:rPr>
+  </w:style>
+  <w:style w:type="paragraph" w:styleId="Header">
+    <w:name w:val="header"/>
+    <w:basedOn w:val="Normal"/>
+    <w:link w:val="HeaderChar"/>
+    <w:uiPriority w:val="99"/>
+    <w:unhideWhenUsed/>
+    <w:rsid w:val="005D3BA2"/>
+    <w:pPr>
+      <w:tabs>
+        <w:tab w:val="center" w:pos="4680"/>
+        <w:tab w:val="right" w:pos="9360"/>
+      </w:tabs>
+      <w:spacing w:after="0" w:line="240" w:lineRule="auto"/>
+    </w:pPr>
+  </w:style>
+  <w:style w:type="character" w:customStyle="1" w:styleId="HeaderChar">
+    <w:name w:val="Header Char"/>
+    <w:basedOn w:val="DefaultParagraphFont"/>
+    <w:link w:val="Header"/>
+    <w:uiPriority w:val="99"/>
+    <w:rsid w:val="005D3BA2"/>
+  </w:style>
+  <w:style w:type="paragraph" w:styleId="Footer">
+    <w:name w:val="footer"/>
+    <w:basedOn w:val="Normal"/>
+    <w:link w:val="FooterChar"/>
+    <w:uiPriority w:val="99"/>
+    <w:unhideWhenUsed/>
+    <w:rsid w:val="005D3BA2"/>
+    <w:pPr>
+      <w:tabs>
+        <w:tab w:val="center" w:pos="4680"/>
+        <w:tab w:val="right" w:pos="9360"/>
+      </w:tabs>
+      <w:spacing w:after="0" w:line="240" w:lineRule="auto"/>
+    </w:pPr>
+  </w:style>
+  <w:style w:type="character" w:customStyle="1" w:styleId="FooterChar">
+    <w:name w:val="Footer Char"/>
+    <w:basedOn w:val="DefaultParagraphFont"/>
+    <w:link w:val="Footer"/>
+    <w:uiPriority w:val="99"/>
+    <w:rsid w:val="005D3BA2"/>
   </w:style>
 </w:styles>
 </file>
@@ -1163,6 +2785,7 @@
   </w:compat>
   <w:rsids>
     <w:rsidRoot w:val="00833BC0"/>
+    <w:rsid w:val="00020858"/>
     <w:rsid w:val="000A7CB7"/>
     <w:rsid w:val="000D0E1C"/>
     <w:rsid w:val="00310617"/>
@@ -1170,7 +2793,6 @@
     <w:rsid w:val="004A0326"/>
     <w:rsid w:val="004F3A22"/>
     <w:rsid w:val="00833BC0"/>
-    <w:rsid w:val="00D345F5"/>
     <w:rsid w:val="00E05234"/>
     <w:rsid w:val="00EF1DAE"/>
   </w:rsids>

</xml_diff>